<commit_message>
Enhance conversation memory and user interaction in the Alfred assistant dashboard
- Implement per-conversation agent memory and user name recognition.
- Refactor prompts to utilize user-provided facts and improve response accuracy.
- Introduce unit tests for conversation memory and guest relation handling.
</commit_message>
<xml_diff>
--- a/docs/PROJECT_SPECIFICATIONS.docx
+++ b/docs/PROJECT_SPECIFICATIONS.docx
@@ -395,7 +395,7 @@
               <w:rPr>
                 <w:sz w:val="16"/>
               </w:rPr>
-              <w:t>8 October 2026</w:t>
+              <w:t>16 October 2026</w:t>
             </w:r>
           </w:p>
         </w:tc>
@@ -1158,7 +1158,7 @@
         </w:rPr>
       </w:pPr>
       <w:r>
-        <w:t>Session-local display of chat messages and operational trace in Streamlit.</w:t>
+        <w:t>Session-local display of chat messages and operational trace in Streamlit, with in-memory conversation checkpoints scoped to each thread.</w:t>
       </w:r>
     </w:p>
     <w:p>
@@ -1438,7 +1438,7 @@
               <w:rPr>
                 <w:sz w:val="16"/>
               </w:rPr>
-              <w:t>Provide a browser-based conversation UI with suggested prompts, chat input, and visible session messages.</w:t>
+              <w:t>Provide a browser-based conversation UI with suggested prompts, a continuously available manual chat input, and visible session messages.</w:t>
             </w:r>
           </w:p>
         </w:tc>
@@ -1459,7 +1459,7 @@
               <w:rPr>
                 <w:sz w:val="16"/>
               </w:rPr>
-              <w:t>Implemented — Streamlit dashboard.</w:t>
+              <w:t>Implemented — Streamlit dashboard; suggested prompts and manual chat input are available together.</w:t>
             </w:r>
           </w:p>
         </w:tc>
@@ -1509,7 +1509,7 @@
               <w:rPr>
                 <w:sz w:val="16"/>
               </w:rPr>
-              <w:t>Clear visible messages, trace, and active guest context for the current UI session.</w:t>
+              <w:t>Clear visible messages, trace, active guest context, and the current conversation checkpoint.</w:t>
             </w:r>
           </w:p>
         </w:tc>
@@ -2143,7 +2143,7 @@
               <w:rPr>
                 <w:sz w:val="16"/>
               </w:rPr>
-              <w:t>Preserve full prior conversation as model context across turns and sessions.</w:t>
+              <w:t>Preserve bounded recent conversation context across turns within an isolated conversation.</w:t>
             </w:r>
           </w:p>
         </w:tc>
@@ -2164,7 +2164,7 @@
               <w:rPr>
                 <w:sz w:val="16"/>
               </w:rPr>
-              <w:t>Not implemented — only latest prompt is submitted by dashboard.</w:t>
+              <w:t>Implemented — LangGraph in-memory checkpoint; up to six prior user/assistant messages, each limited to 1,000 characters, are included in the prompt. The dashboard user is Bruce Wayne; the agent answers name questions directly and interprets each guest Relation field as that guest's relationship to Bruce Wayne. Guest names are matched within questions regardless of their position. State is lost when the app process ends.</w:t>
             </w:r>
           </w:p>
         </w:tc>
@@ -2817,7 +2817,7 @@
         </w:rPr>
       </w:pPr>
       <w:r>
-        <w:t>Streamlit invokes the compiled agent with the latest HumanMessage.</w:t>
+        <w:t>Streamlit invokes the compiled agent with the latest HumanMessage and a per-session thread_id; LangGraph restores that thread checkpoint.</w:t>
       </w:r>
     </w:p>
     <w:p>
@@ -2861,7 +2861,7 @@
         </w:rPr>
       </w:pPr>
       <w:r>
-        <w:t>The dashboard renders the answer and stores prompt, answer, and active guest in session state.</w:t>
+        <w:t>The dashboard renders the answer and stores prompt, answer, and active guest in session state. The model receives up to six prior user/assistant messages, each limited to 1,000 characters, for reference resolution and can use user messages to recall explicitly shared personal facts.</w:t>
       </w:r>
     </w:p>
     <w:p>
@@ -3345,7 +3345,7 @@
         </w:rPr>
       </w:pPr>
       <w:r>
-        <w:t>Visible chat and trace data are held in Streamlit session state; no durable conversation store is provided.</w:t>
+        <w:t>Visible chat and trace data are held in Streamlit session state. LangGraph checkpoints and bounded conversation history remain in process memory; the dashboard user is Bruce Wayne. No durable conversation store is provided.</w:t>
       </w:r>
     </w:p>
     <w:p>
@@ -4939,7 +4939,7 @@
               <w:rPr>
                 <w:sz w:val="16"/>
               </w:rPr>
-              <w:t>Visible history is displayed, but each invocation receives only the latest prompt; agent memory is not retained across turns.</w:t>
+              <w:t>Each Streamlit session has an isolated in-memory LangGraph checkpoint. Up to six prior user/assistant messages, each limited to 1,000 characters, are passed as context, and the dashboard user is Bruce Wayne, whose name is recalled directly; guest Relation fields are interpreted relative to him; clearing the desk deletes the checkpoint, and restarting the process loses all conversation memory.</w:t>
             </w:r>
           </w:p>
         </w:tc>
@@ -5135,7 +5135,7 @@
               <w:rPr>
                 <w:sz w:val="16"/>
               </w:rPr>
-              <w:t>Network/provider failures are not comprehensively tested.</w:t>
+              <w:t>The dashboard shows actionable instructions if Ollama refuses a connection; other network/provider failures are not comprehensively tested.</w:t>
             </w:r>
           </w:p>
         </w:tc>

</xml_diff>